<commit_message>
Revise the M1 report for the KubeVision name and classification premise
Rename KubeBalancer to KubeVision in the report title, body and document
properties, rewrite the Overview around image classification (the course's
template project) instead of storage optimization, and add a Revised line to
the front matter. Regenerate the PDF from the updated Word source.

Co-Authored-By: Claude Opus 5.5 <noreply@anthropic.com>
</commit_message>
<xml_diff>
--- a/docs/report/Milestone1-Report.docx
+++ b/docs/report/Milestone1-Report.docx
@@ -17,7 +17,7 @@
           <w:sz w:val="40"/>
           <w:szCs w:val="40"/>
         </w:rPr>
-        <w:t>KubeBalancer</w:t>
+        <w:t>KubeVision</w:t>
       </w:r>
     </w:p>
     <w:p>
@@ -137,11 +137,11 @@
           <w:b/>
           <w:bCs/>
         </w:rPr>
-        <w:t xml:space="preserve">Repository:  </w:t>
-      </w:r>
-      <w:r>
-        <w:rPr/>
-        <w:t>https://github.com/angeudybp/csc478-project</w:t>
+        <w:t xml:space="preserve">Revised:  </w:t>
+      </w:r>
+      <w:r>
+        <w:rPr/>
+        <w:t>October 23, 2026 (renamed from KubeBalancer; overview rewritten to match the classification premise)</w:t>
       </w:r>
     </w:p>
     <w:p>
@@ -155,6 +155,24 @@
           <w:b/>
           <w:bCs/>
         </w:rPr>
+        <w:t xml:space="preserve">Repository:  </w:t>
+      </w:r>
+      <w:r>
+        <w:rPr/>
+        <w:t>https://github.com/angeudybp/csc478-project</w:t>
+      </w:r>
+    </w:p>
+    <w:p>
+      <w:pPr>
+        <w:pStyle w:val="Normal"/>
+        <w:spacing w:before="0" w:after="40"/>
+        <w:rPr/>
+      </w:pPr>
+      <w:r>
+        <w:rPr>
+          <w:b/>
+          <w:bCs/>
+        </w:rPr>
         <w:t xml:space="preserve">Project idea:  </w:t>
       </w:r>
       <w:r>
@@ -180,71 +198,7 @@
       </w:pPr>
       <w:r>
         <w:rPr/>
-        <w:t xml:space="preserve">One of the biggest issues with </w:t>
-      </w:r>
-      <w:r>
-        <w:rPr/>
-        <w:t xml:space="preserve">image storing </w:t>
-      </w:r>
-      <w:r>
-        <w:rPr/>
-        <w:t xml:space="preserve">is </w:t>
-      </w:r>
-      <w:r>
-        <w:rPr/>
-        <w:t>how quickly image sizes can flood a storage unit due to modern images containing more detailed quality their sizes also increase</w:t>
-      </w:r>
-      <w:r>
-        <w:rPr/>
-        <w:t>,</w:t>
-      </w:r>
-      <w:r>
-        <w:rPr/>
-        <w:t xml:space="preserve"> KubeBalancer is a practical solution to </w:t>
-      </w:r>
-      <w:r>
-        <w:rPr/>
-        <w:t xml:space="preserve">this issue, by optimizing image sizes we can choose cheaper alternatives to achieve the same results. This combined with </w:t>
-      </w:r>
-      <w:r>
-        <w:rPr/>
-        <w:t>storage solutions that have been proven to be reliable and cheap such as AWS S3 buckets and databases for apps that store images, or simply storing said images in personal devices for personal use, using KubeBalancer would</w:t>
-      </w:r>
-      <w:r>
-        <w:rPr/>
-        <w:t xml:space="preserve"> significantly </w:t>
-      </w:r>
-      <w:r>
-        <w:rPr/>
-        <w:t>reduce the cost of storing said images, because rather</w:t>
-      </w:r>
-      <w:r>
-        <w:rPr/>
-        <w:t xml:space="preserve"> than using </w:t>
-      </w:r>
-      <w:r>
-        <w:rPr/>
-        <w:t>raw</w:t>
-      </w:r>
-      <w:r>
-        <w:rPr/>
-        <w:t xml:space="preserve"> images that would </w:t>
-      </w:r>
-      <w:r>
-        <w:rPr/>
-        <w:t>flood storage units very quickly due to their raw sizes occupying more space we instead optimize said images and give users a smaller preprocessed image</w:t>
-      </w:r>
-      <w:r>
-        <w:rPr/>
-        <w:t xml:space="preserve">. KubeBalancer’s goal is to provide users with a simple interface to leverage our image classification software to clean up images and provision users with optimized versions of said images </w:t>
-      </w:r>
-      <w:r>
-        <w:rPr/>
-        <w:t>allowing them to save storage space and in tangent also save money</w:t>
-      </w:r>
-      <w:r>
-        <w:rPr/>
-        <w:t>.</w:t>
+        <w:t xml:space="preserve">Photos pile up faster than anyone can sort them. Tagging a folder of pictures, checking what a trail camera caught, or routing product photos to the right catalog section all start with the same question: what is in this image? KubeVision answers it. Upload a JPEG or PNG and get back the most likely label, how confident the model is, and the next two candidates, all in one request. Every upload is saved with its result, so a past prediction can be looked up later and both the original and the exact 224×224 image the model saw can be downloaded. Behind that single request is a small pipeline built to keep working: each stage runs as its own Kubernetes service, the model tier scales out to three replicas, and a failed pod is replaced while the others keep serving. KubeVision follows the course’s template project, an image classification pipeline on Kubernetes, and uses a small pre-trained model (MobileNetV2) so the work goes into orchestration rather than training.</w:t>
       </w:r>
     </w:p>
     <w:p>
@@ -258,11 +212,11 @@
           <w:b/>
           <w:bCs/>
         </w:rPr>
-        <w:t>KubeBalancer</w:t>
-      </w:r>
-      <w:r>
-        <w:rPr/>
-        <w:t xml:space="preserve"> is a small image classification service on Kubernetes. An end-user uploads an image through one of the two available endpoints and gets the label and the confidence score. Four microservices perform different parts of the task:</w:t>
+        <w:t>KubeVision</w:t>
+      </w:r>
+      <w:r>
+        <w:rPr/>
+        <w:t xml:space="preserve"> is a small image classification service on Kubernetes. A user uploads an image to a single REST endpoint and gets back the label and the confidence score. Four microservices perform different parts of the task:</w:t>
       </w:r>
     </w:p>
     <w:p>
@@ -280,14 +234,7 @@
           <w:b/>
           <w:bCs/>
         </w:rPr>
-        <w:t>G</w:t>
-      </w:r>
-      <w:r>
-        <w:rPr>
-          <w:b/>
-          <w:bCs/>
-        </w:rPr>
-        <w:t>ateway</w:t>
+        <w:t>Gateway</w:t>
       </w:r>
       <w:r>
         <w:rPr/>
@@ -309,14 +256,7 @@
           <w:b/>
           <w:bCs/>
         </w:rPr>
-        <w:t>P</w:t>
-      </w:r>
-      <w:r>
-        <w:rPr>
-          <w:b/>
-          <w:bCs/>
-        </w:rPr>
-        <w:t>reprocess</w:t>
+        <w:t>Preprocess</w:t>
       </w:r>
       <w:r>
         <w:rPr/>
@@ -338,14 +278,7 @@
           <w:b/>
           <w:bCs/>
         </w:rPr>
-        <w:t>I</w:t>
-      </w:r>
-      <w:r>
-        <w:rPr>
-          <w:b/>
-          <w:bCs/>
-        </w:rPr>
-        <w:t>nference</w:t>
+        <w:t>Inference</w:t>
       </w:r>
       <w:r>
         <w:rPr/>
@@ -367,14 +300,7 @@
           <w:b/>
           <w:bCs/>
         </w:rPr>
-        <w:t>S</w:t>
-      </w:r>
-      <w:r>
-        <w:rPr>
-          <w:b/>
-          <w:bCs/>
-        </w:rPr>
-        <w:t>torage</w:t>
+        <w:t>Storage</w:t>
       </w:r>
       <w:r>
         <w:rPr/>
@@ -389,23 +315,7 @@
       </w:pPr>
       <w:r>
         <w:rPr/>
-        <w:t xml:space="preserve">Everything runs on a single-node Minikube cluster </w:t>
-      </w:r>
-      <w:r>
-        <w:rPr/>
-        <w:t>which allows this project to be replicated in any user’s machines.</w:t>
-      </w:r>
-      <w:r>
-        <w:rPr/>
-        <w:t xml:space="preserve"> Three </w:t>
-      </w:r>
-      <w:r>
-        <w:rPr/>
-        <w:t>design choices drive the architecture</w:t>
-      </w:r>
-      <w:r>
-        <w:rPr/>
-        <w:t>:</w:t>
+        <w:t xml:space="preserve">Everything runs on a single-node Minikube cluster which allows this project to be replicated in any user’s machines. Three design choices drive the architecture:</w:t>
       </w:r>
     </w:p>
     <w:p>
@@ -423,21 +333,7 @@
           <w:b/>
           <w:bCs/>
         </w:rPr>
-        <w:t xml:space="preserve">A </w:t>
-      </w:r>
-      <w:r>
-        <w:rPr>
-          <w:b/>
-          <w:bCs/>
-        </w:rPr>
-        <w:t>c</w:t>
-      </w:r>
-      <w:r>
-        <w:rPr>
-          <w:b/>
-          <w:bCs/>
-        </w:rPr>
-        <w:t>entralized gateway</w:t>
+        <w:t xml:space="preserve">A centralized gateway</w:t>
       </w:r>
       <w:r>
         <w:rPr/>
@@ -554,14 +450,24 @@
           <w:i/>
           <w:iCs/>
         </w:rPr>
-        <w:t xml:space="preserve">    • </w:t>
-      </w:r>
-      <w:r>
+        <w:t xml:space="preserve">    • POST /api/v1/images with a valid file less than 8MB returns 200 with the imageId, label, confidence and the first 3 classes.</w:t>
+      </w:r>
+    </w:p>
+    <w:p>
+      <w:pPr>
+        <w:pStyle w:val="Normal"/>
+        <w:spacing w:before="0" w:after="100"/>
         <w:rPr>
           <w:i/>
           <w:iCs/>
         </w:rPr>
-        <w:t>POST /api/v1/images with a valid file less than 8MB returns 200 with the imageId, label, confidence and the first 3 classes.</w:t>
+      </w:pPr>
+      <w:r>
+        <w:rPr>
+          <w:i/>
+          <w:iCs/>
+        </w:rPr>
+        <w:t xml:space="preserve">    • The image file bigger than 8 MB results in error 413; non-image file bigger than 0 bytes results in 415. None of the errors causes pod crash. </w:t>
       </w:r>
     </w:p>
     <w:p>
@@ -578,38 +484,7 @@
           <w:i/>
           <w:iCs/>
         </w:rPr>
-        <w:t xml:space="preserve">    • </w:t>
-      </w:r>
-      <w:r>
-        <w:rPr>
-          <w:i/>
-          <w:iCs/>
-        </w:rPr>
-        <w:t xml:space="preserve">The image file bigger than 8 MB results in error 413; non-image file bigger than 0 bytes results in 415. None of the errors causes pod crash. </w:t>
-      </w:r>
-    </w:p>
-    <w:p>
-      <w:pPr>
-        <w:pStyle w:val="Normal"/>
-        <w:spacing w:before="0" w:after="100"/>
-        <w:rPr>
-          <w:i/>
-          <w:iCs/>
-        </w:rPr>
-      </w:pPr>
-      <w:r>
-        <w:rPr>
-          <w:i/>
-          <w:iCs/>
-        </w:rPr>
-        <w:t xml:space="preserve">    • </w:t>
-      </w:r>
-      <w:r>
-        <w:rPr>
-          <w:i/>
-          <w:iCs/>
-        </w:rPr>
-        <w:t>Tests: T1-T6.</w:t>
+        <w:t xml:space="preserve">    • Tests: T1-T6.</w:t>
       </w:r>
     </w:p>
     <w:p>
@@ -652,14 +527,24 @@
           <w:i/>
           <w:iCs/>
         </w:rPr>
-        <w:t xml:space="preserve">    • </w:t>
-      </w:r>
-      <w:r>
+        <w:t xml:space="preserve">    • GET /api/v1/results/{imageId} gives me the saved prediction and if I request a wrong imageId, the system returns 404 error.</w:t>
+      </w:r>
+    </w:p>
+    <w:p>
+      <w:pPr>
+        <w:pStyle w:val="Normal"/>
+        <w:spacing w:before="0" w:after="100"/>
         <w:rPr>
           <w:i/>
           <w:iCs/>
         </w:rPr>
-        <w:t>GET /api/v1/results/{imageId} gives me the saved prediction and if I request a wrong imageId, the system returns 404 error.</w:t>
+      </w:pPr>
+      <w:r>
+        <w:rPr>
+          <w:i/>
+          <w:iCs/>
+        </w:rPr>
+        <w:t xml:space="preserve">    • I can download the original and the processed images using image ID.</w:t>
       </w:r>
     </w:p>
     <w:p>
@@ -676,38 +561,7 @@
           <w:i/>
           <w:iCs/>
         </w:rPr>
-        <w:t xml:space="preserve">    • </w:t>
-      </w:r>
-      <w:r>
-        <w:rPr>
-          <w:i/>
-          <w:iCs/>
-        </w:rPr>
-        <w:t>I can download the original and the processed images using image ID.</w:t>
-      </w:r>
-    </w:p>
-    <w:p>
-      <w:pPr>
-        <w:pStyle w:val="Normal"/>
-        <w:spacing w:before="0" w:after="100"/>
-        <w:rPr>
-          <w:i/>
-          <w:iCs/>
-        </w:rPr>
-      </w:pPr>
-      <w:r>
-        <w:rPr>
-          <w:i/>
-          <w:iCs/>
-        </w:rPr>
-        <w:t xml:space="preserve">    • </w:t>
-      </w:r>
-      <w:r>
-        <w:rPr>
-          <w:i/>
-          <w:iCs/>
-        </w:rPr>
-        <w:t>The results stay available even after recreating the storage pod. Tests: T7, T11.</w:t>
+        <w:t xml:space="preserve">    • The results stay available even after recreating the storage pod. Tests: T7, T11.</w:t>
       </w:r>
     </w:p>
     <w:p>
@@ -750,14 +604,24 @@
           <w:i/>
           <w:iCs/>
         </w:rPr>
-        <w:t xml:space="preserve">    • </w:t>
-      </w:r>
-      <w:r>
+        <w:t xml:space="preserve">    • The inference scales up to 3 replicas and the metrics sidecar shows the request load on each one of the pods.</w:t>
+      </w:r>
+    </w:p>
+    <w:p>
+      <w:pPr>
+        <w:pStyle w:val="Normal"/>
+        <w:spacing w:before="0" w:after="100"/>
         <w:rPr>
           <w:i/>
           <w:iCs/>
         </w:rPr>
-        <w:t>The inference scales up to 3 replicas and the metrics sidecar shows the request load on each one of the pods.</w:t>
+      </w:pPr>
+      <w:r>
+        <w:rPr>
+          <w:i/>
+          <w:iCs/>
+        </w:rPr>
+        <w:t xml:space="preserve">    • Deleting one of the inference pods automatically triggers creating it while the rest continue working.</w:t>
       </w:r>
     </w:p>
     <w:p>
@@ -774,62 +638,24 @@
           <w:i/>
           <w:iCs/>
         </w:rPr>
-        <w:t xml:space="preserve">    • </w:t>
-      </w:r>
-      <w:r>
+        <w:t xml:space="preserve">    • The gateway returns 503 code, when I stop the inference, instead of hang.  </w:t>
+      </w:r>
+    </w:p>
+    <w:p>
+      <w:pPr>
+        <w:pStyle w:val="Normal"/>
+        <w:spacing w:before="0" w:after="100"/>
         <w:rPr>
           <w:i/>
           <w:iCs/>
         </w:rPr>
-        <w:t>Deleting one of the inference pods automatically triggers creating it while the rest continue working.</w:t>
-      </w:r>
-    </w:p>
-    <w:p>
-      <w:pPr>
-        <w:pStyle w:val="Normal"/>
-        <w:spacing w:before="0" w:after="100"/>
+      </w:pPr>
+      <w:r>
         <w:rPr>
           <w:i/>
           <w:iCs/>
         </w:rPr>
-      </w:pPr>
-      <w:r>
-        <w:rPr>
-          <w:i/>
-          <w:iCs/>
-        </w:rPr>
-        <w:t xml:space="preserve">    • </w:t>
-      </w:r>
-      <w:r>
-        <w:rPr>
-          <w:i/>
-          <w:iCs/>
-        </w:rPr>
-        <w:t xml:space="preserve">The gateway returns 503 code, when I stop the inference, instead of hang.  </w:t>
-      </w:r>
-    </w:p>
-    <w:p>
-      <w:pPr>
-        <w:pStyle w:val="Normal"/>
-        <w:spacing w:before="0" w:after="100"/>
-        <w:rPr>
-          <w:i/>
-          <w:iCs/>
-        </w:rPr>
-      </w:pPr>
-      <w:r>
-        <w:rPr>
-          <w:i/>
-          <w:iCs/>
-        </w:rPr>
-        <w:t xml:space="preserve">    • </w:t>
-      </w:r>
-      <w:r>
-        <w:rPr>
-          <w:i/>
-          <w:iCs/>
-        </w:rPr>
-        <w:t>kubectl delete -f . &amp;&amp; kubectl apply -f . restores the whole stack without additional actions. Tests: T8-T10, T12, T13.</w:t>
+        <w:t xml:space="preserve">    • kubectl delete -f . &amp;&amp; kubectl apply -f . restores the whole stack without additional actions. Tests: T8-T10, T12, T13.</w:t>
       </w:r>
     </w:p>
     <w:p>
@@ -3746,15 +3572,7 @@
           <w:sz w:val="16"/>
           <w:szCs w:val="16"/>
         </w:rPr>
-        <w:t xml:space="preserve">               </w:t>
-      </w:r>
-      <w:r>
-        <w:rPr>
-          <w:rFonts w:eastAsia="Courier New" w:cs="Courier New" w:ascii="Courier New" w:hAnsi="Courier New"/>
-          <w:sz w:val="16"/>
-          <w:szCs w:val="16"/>
-        </w:rPr>
-        <w:t>12-inference.yaml  13-storage.yaml</w:t>
+        <w:t xml:space="preserve">               12-inference.yaml  13-storage.yaml</w:t>
       </w:r>
     </w:p>
     <w:p>
@@ -3792,15 +3610,7 @@
           <w:sz w:val="16"/>
           <w:szCs w:val="16"/>
         </w:rPr>
-        <w:t xml:space="preserve">               </w:t>
-      </w:r>
-      <w:r>
-        <w:rPr>
-          <w:rFonts w:eastAsia="Courier New" w:cs="Courier New" w:ascii="Courier New" w:hAnsi="Courier New"/>
-          <w:sz w:val="16"/>
-          <w:szCs w:val="16"/>
-        </w:rPr>
-        <w:t>22-inference-svc.yaml  23-storage-svc.yaml</w:t>
+        <w:t xml:space="preserve">               22-inference-svc.yaml  23-storage-svc.yaml</w:t>
       </w:r>
     </w:p>
     <w:p>
@@ -3897,15 +3707,7 @@
           <w:sz w:val="16"/>
           <w:szCs w:val="16"/>
         </w:rPr>
-        <w:t xml:space="preserve">  </w:t>
-      </w:r>
-      <w:r>
-        <w:rPr>
-          <w:rFonts w:eastAsia="Courier New" w:cs="Courier New" w:ascii="Courier New" w:hAnsi="Courier New"/>
-          <w:sz w:val="16"/>
-          <w:szCs w:val="16"/>
-        </w:rPr>
-        <w:t>"requestId": "7f3c1e9a" }</w:t>
+        <w:t xml:space="preserve">  "requestId": "7f3c1e9a" }</w:t>
       </w:r>
     </w:p>
     <w:p>
@@ -4322,15 +4124,7 @@
           <w:sz w:val="16"/>
           <w:szCs w:val="16"/>
         </w:rPr>
-        <w:t xml:space="preserve">  </w:t>
-      </w:r>
-      <w:r>
-        <w:rPr>
-          <w:rFonts w:eastAsia="Courier New" w:cs="Courier New" w:ascii="Courier New" w:hAnsi="Courier New"/>
-          <w:sz w:val="16"/>
-          <w:szCs w:val="16"/>
-        </w:rPr>
-        <w:t>"label": "golden retriever", "confidence": 0.8734,</w:t>
+        <w:t xml:space="preserve">  "label": "golden retriever", "confidence": 0.8734,</w:t>
       </w:r>
     </w:p>
     <w:p>
@@ -4349,15 +4143,7 @@
           <w:sz w:val="16"/>
           <w:szCs w:val="16"/>
         </w:rPr>
-        <w:t xml:space="preserve">  </w:t>
-      </w:r>
-      <w:r>
-        <w:rPr>
-          <w:rFonts w:eastAsia="Courier New" w:cs="Courier New" w:ascii="Courier New" w:hAnsi="Courier New"/>
-          <w:sz w:val="16"/>
-          <w:szCs w:val="16"/>
-        </w:rPr>
-        <w:t>"topK": [ {"label": "golden retriever", "score": 0.8734},</w:t>
+        <w:t xml:space="preserve">  "topK": [ {"label": "golden retriever", "score": 0.8734},</w:t>
       </w:r>
     </w:p>
     <w:p>
@@ -4376,15 +4162,7 @@
           <w:sz w:val="16"/>
           <w:szCs w:val="16"/>
         </w:rPr>
-        <w:t xml:space="preserve">            </w:t>
-      </w:r>
-      <w:r>
-        <w:rPr>
-          <w:rFonts w:eastAsia="Courier New" w:cs="Courier New" w:ascii="Courier New" w:hAnsi="Courier New"/>
-          <w:sz w:val="16"/>
-          <w:szCs w:val="16"/>
-        </w:rPr>
-        <w:t>{"label": "Labrador retriever", "score": 0.0612},</w:t>
+        <w:t xml:space="preserve">            {"label": "Labrador retriever", "score": 0.0612},</w:t>
       </w:r>
     </w:p>
     <w:p>
@@ -4403,15 +4181,7 @@
           <w:sz w:val="16"/>
           <w:szCs w:val="16"/>
         </w:rPr>
-        <w:t xml:space="preserve">            </w:t>
-      </w:r>
-      <w:r>
-        <w:rPr>
-          <w:rFonts w:eastAsia="Courier New" w:cs="Courier New" w:ascii="Courier New" w:hAnsi="Courier New"/>
-          <w:sz w:val="16"/>
-          <w:szCs w:val="16"/>
-        </w:rPr>
-        <w:t>{"label": "kuvasz", "score": 0.0188} ],</w:t>
+        <w:t xml:space="preserve">            {"label": "kuvasz", "score": 0.0188} ],</w:t>
       </w:r>
     </w:p>
     <w:p>
@@ -4430,15 +4200,7 @@
           <w:sz w:val="16"/>
           <w:szCs w:val="16"/>
         </w:rPr>
-        <w:t xml:space="preserve">  </w:t>
-      </w:r>
-      <w:r>
-        <w:rPr>
-          <w:rFonts w:eastAsia="Courier New" w:cs="Courier New" w:ascii="Courier New" w:hAnsi="Courier New"/>
-          <w:sz w:val="16"/>
-          <w:szCs w:val="16"/>
-        </w:rPr>
-        <w:t>"modelVersion": "mobilenetv2-1.0-onnx", "mock": false,</w:t>
+        <w:t xml:space="preserve">  "modelVersion": "mobilenetv2-1.0-onnx", "mock": false,</w:t>
       </w:r>
     </w:p>
     <w:p>
@@ -4457,15 +4219,7 @@
           <w:sz w:val="16"/>
           <w:szCs w:val="16"/>
         </w:rPr>
-        <w:t xml:space="preserve">  </w:t>
-      </w:r>
-      <w:r>
-        <w:rPr>
-          <w:rFonts w:eastAsia="Courier New" w:cs="Courier New" w:ascii="Courier New" w:hAnsi="Courier New"/>
-          <w:sz w:val="16"/>
-          <w:szCs w:val="16"/>
-        </w:rPr>
-        <w:t>"timings": {"preprocessMs": 38, "inferenceMs": 121, "storageMs": 44, "totalMs": 207},</w:t>
+        <w:t xml:space="preserve">  "timings": {"preprocessMs": 38, "inferenceMs": 121, "storageMs": 44, "totalMs": 207},</w:t>
       </w:r>
     </w:p>
     <w:p>
@@ -4484,15 +4238,7 @@
           <w:sz w:val="16"/>
           <w:szCs w:val="16"/>
         </w:rPr>
-        <w:t xml:space="preserve">  </w:t>
-      </w:r>
-      <w:r>
-        <w:rPr>
-          <w:rFonts w:eastAsia="Courier New" w:cs="Courier New" w:ascii="Courier New" w:hAnsi="Courier New"/>
-          <w:sz w:val="16"/>
-          <w:szCs w:val="16"/>
-        </w:rPr>
-        <w:t>"requestId": "7f3c1e9a" }</w:t>
+        <w:t xml:space="preserve">  "requestId": "7f3c1e9a" }</w:t>
       </w:r>
     </w:p>
     <w:p>
@@ -6632,15 +6378,7 @@
           <w:sz w:val="16"/>
           <w:szCs w:val="16"/>
         </w:rPr>
-        <w:t xml:space="preserve">├── </w:t>
-      </w:r>
-      <w:r>
-        <w:rPr>
-          <w:rFonts w:eastAsia="Courier New" w:cs="Courier New" w:ascii="Courier New" w:hAnsi="Courier New"/>
-          <w:sz w:val="16"/>
-          <w:szCs w:val="16"/>
-        </w:rPr>
-        <w:t>originals/&lt;yyyy&gt;/&lt;mm&gt;/&lt;dd&gt;/&lt;imageId&gt;.&lt;ext&gt;   original upload</w:t>
+        <w:t xml:space="preserve">├── originals/&lt;yyyy&gt;/&lt;mm&gt;/&lt;dd&gt;/&lt;imageId&gt;.&lt;ext&gt;   original upload</w:t>
       </w:r>
     </w:p>
     <w:p>
@@ -6659,15 +6397,7 @@
           <w:sz w:val="16"/>
           <w:szCs w:val="16"/>
         </w:rPr>
-        <w:t xml:space="preserve">├── </w:t>
-      </w:r>
-      <w:r>
-        <w:rPr>
-          <w:rFonts w:eastAsia="Courier New" w:cs="Courier New" w:ascii="Courier New" w:hAnsi="Courier New"/>
-          <w:sz w:val="16"/>
-          <w:szCs w:val="16"/>
-        </w:rPr>
-        <w:t>processed/&lt;yyyy&gt;/&lt;mm&gt;/&lt;dd&gt;/&lt;imageId&gt;.jpg     224x224 model input</w:t>
+        <w:t xml:space="preserve">├── processed/&lt;yyyy&gt;/&lt;mm&gt;/&lt;dd&gt;/&lt;imageId&gt;.jpg     224x224 model input</w:t>
       </w:r>
     </w:p>
     <w:p>
@@ -6686,15 +6416,7 @@
           <w:sz w:val="16"/>
           <w:szCs w:val="16"/>
         </w:rPr>
-        <w:t xml:space="preserve">├── </w:t>
-      </w:r>
-      <w:r>
-        <w:rPr>
-          <w:rFonts w:eastAsia="Courier New" w:cs="Courier New" w:ascii="Courier New" w:hAnsi="Courier New"/>
-          <w:sz w:val="16"/>
-          <w:szCs w:val="16"/>
-        </w:rPr>
-        <w:t>results/&lt;imageId&gt;.json                       prediction record</w:t>
+        <w:t xml:space="preserve">├── results/&lt;imageId&gt;.json                       prediction record</w:t>
       </w:r>
     </w:p>
     <w:p>
@@ -6713,15 +6435,7 @@
           <w:sz w:val="16"/>
           <w:szCs w:val="16"/>
         </w:rPr>
-        <w:t xml:space="preserve">└── </w:t>
-      </w:r>
-      <w:r>
-        <w:rPr>
-          <w:rFonts w:eastAsia="Courier New" w:cs="Courier New" w:ascii="Courier New" w:hAnsi="Courier New"/>
-          <w:sz w:val="16"/>
-          <w:szCs w:val="16"/>
-        </w:rPr>
-        <w:t>index/manifest.jsonl                         one line per upload (for listing)</w:t>
+        <w:t xml:space="preserve">└── index/manifest.jsonl                         one line per upload (for listing)</w:t>
       </w:r>
     </w:p>
     <w:p>

</xml_diff>

<commit_message>
Revise the M1 report for FABRIC as the deployment target
Describe the three-node k3s cluster on FABRIC as the target, with Minikube
kept for local testing: overview, Service choices (NodePort reached through
an SSH tunnel), images on public GHCR packages, the k3s local-path storage
class for the PVC, risks and the team charter. Re-render the topology
diagram with the pinned mermaid-cli 11.17.0 and embed it in the report,
regenerate the PDF, and note the revision in the README.

Co-Authored-By: Claude Opus 5.5 <noreply@anthropic.com>
</commit_message>
<xml_diff>
--- a/docs/report/Milestone1-Report.docx
+++ b/docs/report/Milestone1-Report.docx
@@ -141,7 +141,7 @@
       </w:r>
       <w:r>
         <w:rPr/>
-        <w:t>October 23, 2026 (renamed from KubeBalancer; overview rewritten to match the classification premise)</w:t>
+        <w:t>October 23, 2026 (renamed from KubeBalancer; overview rewritten to match the classification premise; deployment target changed from Minikube to k3s on FABRIC)</w:t>
       </w:r>
     </w:p>
     <w:p>
@@ -315,7 +315,7 @@
       </w:pPr>
       <w:r>
         <w:rPr/>
-        <w:t xml:space="preserve">Everything runs on a single-node Minikube cluster which allows this project to be replicated in any user’s machines. Three design choices drive the architecture:</w:t>
+        <w:t xml:space="preserve">Everything runs on a three-node k3s cluster (one server, two agents) on the FABRIC testbed. The same manifests also run unchanged on single-node Minikube, which is used for local development and testing. Three design choices drive the architecture:</w:t>
       </w:r>
     </w:p>
     <w:p>
@@ -775,7 +775,7 @@
       </w:pPr>
       <w:r>
         <w:rPr/>
-        <w:t>The design follows the brief's constraints: exactly one external entrypoint, at least one multi-container pod, and one component scaled to three or more replicas. It targets single-node Minikube, which has no cloud load balancer and only one node for storage.</w:t>
+        <w:t>The design follows the brief's constraints: exactly one external entrypoint, at least one multi-container pod, and one component scaled to three or more replicas. It targets a three-node k3s cluster on FABRIC, which has no cloud load balancer, and whose storage volumes live on a single node. Minikube runs the same manifests for local testing.</w:t>
       </w:r>
     </w:p>
     <w:p>
@@ -1916,7 +1916,7 @@
                 <w:sz w:val="18"/>
                 <w:szCs w:val="18"/>
               </w:rPr>
-              <w:t xml:space="preserve">The single public entrypoint. Minikube has no cloud load balancer, so a </w:t>
+              <w:t xml:space="preserve">The single public entrypoint. Neither k3s on FABRIC nor Minikube has a cloud load balancer, so a </w:t>
             </w:r>
             <w:r>
               <w:rPr>
@@ -1946,7 +1946,7 @@
                 <w:sz w:val="18"/>
                 <w:szCs w:val="18"/>
               </w:rPr>
-              <w:t>; NodePort works out of the box.</w:t>
+              <w:t>; NodePort works on both. On FABRIC it is reached through an SSH tunnel to a cluster node.</w:t>
             </w:r>
           </w:p>
         </w:tc>
@@ -3477,7 +3477,7 @@
       </w:r>
       <w:r>
         <w:rPr/>
-        <w:t xml:space="preserve">), loaded into Minikube with </w:t>
+        <w:t xml:space="preserve">), published as public packages on GitHub Container Registry so FABRIC nodes can pull them without credentials. For local runs they are copied into Minikube with </w:t>
       </w:r>
       <w:r>
         <w:rPr>
@@ -4048,7 +4048,7 @@
           <w:b/>
           <w:bCs/>
         </w:rPr>
-        <w:t>Example request and response:</w:t>
+        <w:t>Example request and response (through an SSH tunnel that forwards localhost:30080 to the gateway NodePort on FABRIC):</w:t>
       </w:r>
     </w:p>
     <w:p>
@@ -4067,7 +4067,7 @@
           <w:sz w:val="16"/>
           <w:szCs w:val="16"/>
         </w:rPr>
-        <w:t>curl -X POST "http://$(minikube ip):30080/api/v1/images" -F "file=@dog.jpg"</w:t>
+        <w:t>curl -X POST "http://localhost:30080/api/v1/images" -F "file=@dog.jpg"</w:t>
       </w:r>
     </w:p>
     <w:p>
@@ -6292,7 +6292,7 @@
       </w:r>
       <w:r>
         <w:rPr/>
-        <w:t xml:space="preserve">: 2 Gi, ReadWriteOnce, Minikube's default </w:t>
+        <w:t xml:space="preserve">: 2 Gi, ReadWriteOnce, k3s’s built-in </w:t>
       </w:r>
       <w:r>
         <w:rPr>
@@ -6300,11 +6300,11 @@
           <w:sz w:val="18"/>
           <w:szCs w:val="18"/>
         </w:rPr>
-        <w:t>standard</w:t>
-      </w:r>
-      <w:r>
-        <w:rPr/>
-        <w:t xml:space="preserve"> storage class, mounted at </w:t>
+        <w:t>local-path</w:t>
+      </w:r>
+      <w:r>
+        <w:rPr/>
+        <w:t xml:space="preserve"> storage class (Minikube’s </w:t>
       </w:r>
       <w:r>
         <w:rPr>
@@ -6312,11 +6312,11 @@
           <w:sz w:val="18"/>
           <w:szCs w:val="18"/>
         </w:rPr>
-        <w:t>/data</w:t>
-      </w:r>
-      <w:r>
-        <w:rPr/>
-        <w:t xml:space="preserve"> in the storage pod only. Reclaim policy is </w:t>
+        <w:t>standard</w:t>
+      </w:r>
+      <w:r>
+        <w:rPr/>
+        <w:t xml:space="preserve"> class when testing locally), mounted at </w:t>
       </w:r>
       <w:r>
         <w:rPr>
@@ -6324,11 +6324,23 @@
           <w:sz w:val="18"/>
           <w:szCs w:val="18"/>
         </w:rPr>
+        <w:t>/data</w:t>
+      </w:r>
+      <w:r>
+        <w:rPr/>
+        <w:t xml:space="preserve"> in the storage pod only. Reclaim policy is </w:t>
+      </w:r>
+      <w:r>
+        <w:rPr>
+          <w:rFonts w:eastAsia="Courier New" w:cs="Courier New" w:ascii="Courier New" w:hAnsi="Courier New"/>
+          <w:sz w:val="18"/>
+          <w:szCs w:val="18"/>
+        </w:rPr>
         <w:t>Retain</w:t>
       </w:r>
       <w:r>
         <w:rPr/>
-        <w:t xml:space="preserve">, so deleting the claim does not immediately delete the data. A manually created </w:t>
+        <w:t xml:space="preserve"> (set on the bound volume, since local-path defaults to Delete), so deleting the claim does not immediately delete the data. A local-path volume lives on one node, so the storage pod always runs on that node. A manually created </w:t>
       </w:r>
       <w:r>
         <w:rPr>
@@ -6842,7 +6854,7 @@
                 <w:sz w:val="18"/>
                 <w:szCs w:val="18"/>
               </w:rPr>
-              <w:t xml:space="preserve"> slows pod startup or fails to load on Minikube.</w:t>
+              <w:t xml:space="preserve"> slows pod startup or fails to load on the cluster nodes.</w:t>
             </w:r>
           </w:p>
         </w:tc>
@@ -7125,7 +7137,7 @@
                 <w:sz w:val="18"/>
                 <w:szCs w:val="18"/>
               </w:rPr>
-              <w:t xml:space="preserve"> with three inference replicas on one node.</w:t>
+              <w:t xml:space="preserve"> when inference replicas share a node.</w:t>
             </w:r>
           </w:p>
         </w:tc>
@@ -10102,7 +10114,7 @@
                 <w:sz w:val="18"/>
                 <w:szCs w:val="18"/>
               </w:rPr>
-              <w:t>Minikube, manifests, Services, health checks, resource limits, PV/PVC, teardown and rebuild.</w:t>
+              <w:t>FABRIC slice and k3s cluster, Minikube for local testing, manifests, Services, health checks, resource limits, PV/PVC, teardown and rebuild.</w:t>
             </w:r>
           </w:p>
         </w:tc>

</xml_diff>

<commit_message>
Deploy on FABRIC with RKE2 using the course's Ansible playbooks
Replace the k3s slice notebook and install script with a runbook
(fabric/kubevision.ipynb) for the course's local FABRIC environment. It
builds a 3-node RKE2 cluster with the course's prerequisites, NFS and RKE2
playbooks (templates copied unchanged), uses a random join token instead of
the helper's fixed default, deploys KubeVision, runs the smoke test and the
evidence script on node1, and opens an SSH tunnel on the container's
published port 3000 for the UI.

Port load-images.sh to RKE2's containerd, rewrite the fabric/ README and
migration guide, and update the README, gateway Service comment, topology
diagram and M1 report (RKE2, NFS-backed volume instead of local-path).

Co-Authored-By: Claude Opus 5.5 <noreply@anthropic.com>
</commit_message>
<xml_diff>
--- a/docs/report/Milestone1-Report.docx
+++ b/docs/report/Milestone1-Report.docx
@@ -141,7 +141,7 @@
       </w:r>
       <w:r>
         <w:rPr/>
-        <w:t>October 23, 2026 (renamed from KubeBalancer; overview rewritten to match the classification premise; deployment target changed from Minikube to k3s on FABRIC)</w:t>
+        <w:t>October 23, 2026 (renamed from KubeBalancer; overview rewritten to match the classification premise; deployment target changed from Minikube to RKE2 on FABRIC)</w:t>
       </w:r>
     </w:p>
     <w:p>
@@ -315,7 +315,7 @@
       </w:pPr>
       <w:r>
         <w:rPr/>
-        <w:t xml:space="preserve">Everything runs on a three-node k3s cluster (one server, two agents) on the FABRIC testbed. The same manifests also run unchanged on single-node Minikube, which is used for local development and testing. Three design choices drive the architecture:</w:t>
+        <w:t xml:space="preserve">Everything runs on a three-node RKE2 cluster (one server, two agents) on the FABRIC testbed, built with the course’s Ansible playbooks. The same manifests also run unchanged on single-node Minikube, which is used for local development and testing. Three design choices drive the architecture:</w:t>
       </w:r>
     </w:p>
     <w:p>
@@ -775,7 +775,7 @@
       </w:pPr>
       <w:r>
         <w:rPr/>
-        <w:t>The design follows the brief's constraints: exactly one external entrypoint, at least one multi-container pod, and one component scaled to three or more replicas. It targets a three-node k3s cluster on FABRIC, which has no cloud load balancer, and whose storage volumes live on a single node. Minikube runs the same manifests for local testing.</w:t>
+        <w:t>The design follows the brief's constraints: exactly one external entrypoint, at least one multi-container pod, and one component scaled to three or more replicas. It targets a three-node RKE2 cluster on FABRIC, which has no cloud load balancer and keeps persistent data on an NFS share exported by the server node. Minikube runs the same manifests for local testing.</w:t>
       </w:r>
     </w:p>
     <w:p>
@@ -1916,7 +1916,7 @@
                 <w:sz w:val="18"/>
                 <w:szCs w:val="18"/>
               </w:rPr>
-              <w:t xml:space="preserve">The single public entrypoint. Neither k3s on FABRIC nor Minikube has a cloud load balancer, so a </w:t>
+              <w:t xml:space="preserve">The single public entrypoint. Neither RKE2 on FABRIC nor Minikube has a cloud load balancer, so a </w:t>
             </w:r>
             <w:r>
               <w:rPr>
@@ -6292,7 +6292,7 @@
       </w:r>
       <w:r>
         <w:rPr/>
-        <w:t xml:space="preserve">: 2 Gi, ReadWriteOnce, k3s’s built-in </w:t>
+        <w:t xml:space="preserve">: 2 Gi, ReadWriteOnce. On FABRIC it binds to a statically created NFS PersistentVolume on the share that the server node exports to the other nodes over the private network (</w:t>
       </w:r>
       <w:r>
         <w:rPr>
@@ -6300,11 +6300,11 @@
           <w:sz w:val="18"/>
           <w:szCs w:val="18"/>
         </w:rPr>
-        <w:t>local-path</w:t>
-      </w:r>
-      <w:r>
-        <w:rPr/>
-        <w:t xml:space="preserve"> storage class (Minikube’s </w:t>
+        <w:t>/opt/data</w:t>
+      </w:r>
+      <w:r>
+        <w:rPr/>
+        <w:t xml:space="preserve">, set up by the course’s NFS playbook); on Minikube it uses the default </w:t>
       </w:r>
       <w:r>
         <w:rPr>
@@ -6316,7 +6316,7 @@
       </w:r>
       <w:r>
         <w:rPr/>
-        <w:t xml:space="preserve"> class when testing locally), mounted at </w:t>
+        <w:t xml:space="preserve"> storage class. It is mounted at </w:t>
       </w:r>
       <w:r>
         <w:rPr>
@@ -6340,7 +6340,7 @@
       </w:r>
       <w:r>
         <w:rPr/>
-        <w:t xml:space="preserve"> (set on the bound volume, since local-path defaults to Delete), so deleting the claim does not immediately delete the data. A local-path volume lives on one node, so the storage pod always runs on that node. A manually created </w:t>
+        <w:t xml:space="preserve">, so deleting the claim does not delete the data. Because the data sits on NFS, the storage pod can be rescheduled on any node and still find it. A manually created </w:t>
       </w:r>
       <w:r>
         <w:rPr>
@@ -6352,7 +6352,7 @@
       </w:r>
       <w:r>
         <w:rPr/>
-        <w:t xml:space="preserve"> volume is the backup plan if automatic provisioning fails.</w:t>
+        <w:t xml:space="preserve"> volume is the backup plan if the NFS share is unavailable.</w:t>
       </w:r>
     </w:p>
     <w:p>
@@ -10114,7 +10114,7 @@
                 <w:sz w:val="18"/>
                 <w:szCs w:val="18"/>
               </w:rPr>
-              <w:t>FABRIC slice and k3s cluster, Minikube for local testing, manifests, Services, health checks, resource limits, PV/PVC, teardown and rebuild.</w:t>
+              <w:t>FABRIC slice and RKE2 cluster, Minikube for local testing, manifests, Services, health checks, resource limits, PV/PVC, teardown and rebuild.</w:t>
             </w:r>
           </w:p>
         </w:tc>

</xml_diff>